<commit_message>
Enrich radar vitals proposal with product evidence
</commit_message>
<xml_diff>
--- a/applications/2026/Q2/radar-vitals/申报书.docx
+++ b/applications/2026/Q2/radar-vitals/申报书.docx
@@ -21,13 +21,13 @@
         <w:tblLook w:firstColumn="1" w:firstRow="1" w:lastColumn="0" w:lastRow="0" w:noHBand="0" w:noVBand="1" w:val="04A0"/>
       </w:tblPr>
       <w:tblGrid>
-        <w:gridCol w:w="4824"/>
-        <w:gridCol w:w="4824"/>
+        <w:gridCol w:w="4896"/>
+        <w:gridCol w:w="4896"/>
       </w:tblGrid>
       <w:tr>
         <w:tc>
           <w:tcPr>
-            <w:tcW w:type="dxa" w:w="4824"/>
+            <w:tcW w:type="dxa" w:w="4896"/>
             <w:vAlign w:val="center"/>
           </w:tcPr>
           <w:p>
@@ -38,7 +38,7 @@
         </w:tc>
         <w:tc>
           <w:tcPr>
-            <w:tcW w:type="dxa" w:w="4824"/>
+            <w:tcW w:type="dxa" w:w="4896"/>
             <w:vAlign w:val="center"/>
           </w:tcPr>
           <w:p>
@@ -51,7 +51,7 @@
       <w:tr>
         <w:tc>
           <w:tcPr>
-            <w:tcW w:type="dxa" w:w="4824"/>
+            <w:tcW w:type="dxa" w:w="4896"/>
             <w:vAlign w:val="center"/>
           </w:tcPr>
           <w:p>
@@ -62,7 +62,7 @@
         </w:tc>
         <w:tc>
           <w:tcPr>
-            <w:tcW w:type="dxa" w:w="4824"/>
+            <w:tcW w:type="dxa" w:w="4896"/>
             <w:vAlign w:val="center"/>
           </w:tcPr>
           <w:p>
@@ -75,7 +75,55 @@
       <w:tr>
         <w:tc>
           <w:tcPr>
-            <w:tcW w:type="dxa" w:w="4824"/>
+            <w:tcW w:type="dxa" w:w="4896"/>
+            <w:vAlign w:val="center"/>
+          </w:tcPr>
+          <w:p>
+            <w:r>
+              <w:t>淘宝商品 ID</w:t>
+            </w:r>
+          </w:p>
+        </w:tc>
+        <w:tc>
+          <w:tcPr>
+            <w:tcW w:type="dxa" w:w="4896"/>
+            <w:vAlign w:val="center"/>
+          </w:tcPr>
+          <w:p>
+            <w:r>
+              <w:t>871582539578</w:t>
+            </w:r>
+          </w:p>
+        </w:tc>
+      </w:tr>
+      <w:tr>
+        <w:tc>
+          <w:tcPr>
+            <w:tcW w:type="dxa" w:w="4896"/>
+            <w:vAlign w:val="center"/>
+          </w:tcPr>
+          <w:p>
+            <w:r>
+              <w:t>淘宝短链</w:t>
+            </w:r>
+          </w:p>
+        </w:tc>
+        <w:tc>
+          <w:tcPr>
+            <w:tcW w:type="dxa" w:w="4896"/>
+            <w:vAlign w:val="center"/>
+          </w:tcPr>
+          <w:p>
+            <w:r>
+              <w:t>https://e.tb.cn/h.RcBfbN5y7bpWvFl?tk=XErF5GXZpEW</w:t>
+            </w:r>
+          </w:p>
+        </w:tc>
+      </w:tr>
+      <w:tr>
+        <w:tc>
+          <w:tcPr>
+            <w:tcW w:type="dxa" w:w="4896"/>
             <w:vAlign w:val="center"/>
           </w:tcPr>
           <w:p>
@@ -86,7 +134,7 @@
         </w:tc>
         <w:tc>
           <w:tcPr>
-            <w:tcW w:type="dxa" w:w="4824"/>
+            <w:tcW w:type="dxa" w:w="4896"/>
             <w:vAlign w:val="center"/>
           </w:tcPr>
           <w:p>
@@ -99,7 +147,7 @@
       <w:tr>
         <w:tc>
           <w:tcPr>
-            <w:tcW w:type="dxa" w:w="4824"/>
+            <w:tcW w:type="dxa" w:w="4896"/>
             <w:vAlign w:val="center"/>
           </w:tcPr>
           <w:p>
@@ -110,7 +158,7 @@
         </w:tc>
         <w:tc>
           <w:tcPr>
-            <w:tcW w:type="dxa" w:w="4824"/>
+            <w:tcW w:type="dxa" w:w="4896"/>
             <w:vAlign w:val="center"/>
           </w:tcPr>
           <w:p>
@@ -123,7 +171,7 @@
       <w:tr>
         <w:tc>
           <w:tcPr>
-            <w:tcW w:type="dxa" w:w="4824"/>
+            <w:tcW w:type="dxa" w:w="4896"/>
             <w:vAlign w:val="center"/>
           </w:tcPr>
           <w:p>
@@ -134,12 +182,12 @@
         </w:tc>
         <w:tc>
           <w:tcPr>
-            <w:tcW w:type="dxa" w:w="4824"/>
+            <w:tcW w:type="dxa" w:w="4896"/>
             <w:vAlign w:val="center"/>
           </w:tcPr>
           <w:p>
             <w:r>
-              <w:t>待确认，以淘宝实时价格及实际配件需求为准</w:t>
+              <w:t>待确认，以淘宝实时价格、运费险及配套附件需求为准</w:t>
             </w:r>
           </w:p>
         </w:tc>
@@ -150,7 +198,275 @@
         <w:pStyle w:val="Heading1"/>
       </w:pPr>
       <w:r>
-        <w:t>一、申报背景</w:t>
+        <w:t>一、资料访问和证据来源</w:t>
+      </w:r>
+    </w:p>
+    <w:tbl>
+      <w:tblPr>
+        <w:tblW w:type="auto" w:w="0"/>
+        <w:jc w:val="center"/>
+        <w:tblLook w:firstColumn="1" w:firstRow="1" w:lastColumn="0" w:lastRow="0" w:noHBand="0" w:noVBand="1" w:val="04A0"/>
+      </w:tblPr>
+      <w:tblGrid>
+        <w:gridCol w:w="3264"/>
+        <w:gridCol w:w="3264"/>
+        <w:gridCol w:w="3264"/>
+      </w:tblGrid>
+      <w:tr>
+        <w:tc>
+          <w:tcPr>
+            <w:tcW w:type="dxa" w:w="3264"/>
+          </w:tcPr>
+          <w:p>
+            <w:r>
+              <w:t>资料项</w:t>
+            </w:r>
+          </w:p>
+        </w:tc>
+        <w:tc>
+          <w:tcPr>
+            <w:tcW w:type="dxa" w:w="3264"/>
+          </w:tcPr>
+          <w:p>
+            <w:r>
+              <w:t>访问结果</w:t>
+            </w:r>
+          </w:p>
+        </w:tc>
+        <w:tc>
+          <w:tcPr>
+            <w:tcW w:type="dxa" w:w="3264"/>
+          </w:tcPr>
+          <w:p>
+            <w:r>
+              <w:t>申报用途</w:t>
+            </w:r>
+          </w:p>
+        </w:tc>
+      </w:tr>
+      <w:tr>
+        <w:tc>
+          <w:tcPr>
+            <w:tcW w:type="dxa" w:w="3264"/>
+          </w:tcPr>
+          <w:p>
+            <w:r>
+              <w:t>淘宝短链</w:t>
+            </w:r>
+          </w:p>
+        </w:tc>
+        <w:tc>
+          <w:tcPr>
+            <w:tcW w:type="dxa" w:w="3264"/>
+          </w:tcPr>
+          <w:p>
+            <w:r>
+              <w:t>可访问，解析到商品 ID 871582539578。</w:t>
+            </w:r>
+          </w:p>
+        </w:tc>
+        <w:tc>
+          <w:tcPr>
+            <w:tcW w:type="dxa" w:w="3264"/>
+          </w:tcPr>
+          <w:p>
+            <w:r>
+              <w:t>确认采购对象对应实际商品页。</w:t>
+            </w:r>
+          </w:p>
+        </w:tc>
+      </w:tr>
+      <w:tr>
+        <w:tc>
+          <w:tcPr>
+            <w:tcW w:type="dxa" w:w="3264"/>
+          </w:tcPr>
+          <w:p>
+            <w:r>
+              <w:t>淘宝详情页</w:t>
+            </w:r>
+          </w:p>
+        </w:tc>
+        <w:tc>
+          <w:tcPr>
+            <w:tcW w:type="dxa" w:w="3264"/>
+          </w:tcPr>
+          <w:p>
+            <w:r>
+              <w:t>访问详情页时触发淘宝登录/风控，未能自动读取实时价格和淘宝主图。</w:t>
+            </w:r>
+          </w:p>
+        </w:tc>
+        <w:tc>
+          <w:tcPr>
+            <w:tcW w:type="dxa" w:w="3264"/>
+          </w:tcPr>
+          <w:p>
+            <w:r>
+              <w:t>需采购前人工补充价格截图、规格截图和订单截图。</w:t>
+            </w:r>
+          </w:p>
+        </w:tc>
+      </w:tr>
+      <w:tr>
+        <w:tc>
+          <w:tcPr>
+            <w:tcW w:type="dxa" w:w="3264"/>
+          </w:tcPr>
+          <w:p>
+            <w:r>
+              <w:t>Radxa 官方产品页</w:t>
+            </w:r>
+          </w:p>
+        </w:tc>
+        <w:tc>
+          <w:tcPr>
+            <w:tcW w:type="dxa" w:w="3264"/>
+          </w:tcPr>
+          <w:p>
+            <w:r>
+              <w:t>可访问，提供 Cubie A5E 产品定位和核心卖点。</w:t>
+            </w:r>
+          </w:p>
+        </w:tc>
+        <w:tc>
+          <w:tcPr>
+            <w:tcW w:type="dxa" w:w="3264"/>
+          </w:tcPr>
+          <w:p>
+            <w:r>
+              <w:t>支撑产品外观、边缘主控、双网口等论证。</w:t>
+            </w:r>
+          </w:p>
+        </w:tc>
+      </w:tr>
+      <w:tr>
+        <w:tc>
+          <w:tcPr>
+            <w:tcW w:type="dxa" w:w="3264"/>
+          </w:tcPr>
+          <w:p>
+            <w:r>
+              <w:t>Radxa 官方文档</w:t>
+            </w:r>
+          </w:p>
+        </w:tc>
+        <w:tc>
+          <w:tcPr>
+            <w:tcW w:type="dxa" w:w="3264"/>
+          </w:tcPr>
+          <w:p>
+            <w:r>
+              <w:t>可访问，提供 A527/T527、CPU、网络、USB、GPIO、M.2 等规格表。</w:t>
+            </w:r>
+          </w:p>
+        </w:tc>
+        <w:tc>
+          <w:tcPr>
+            <w:tcW w:type="dxa" w:w="3264"/>
+          </w:tcPr>
+          <w:p>
+            <w:r>
+              <w:t>作为技术适配性论证依据。</w:t>
+            </w:r>
+          </w:p>
+        </w:tc>
+      </w:tr>
+    </w:tbl>
+    <w:p>
+      <w:r>
+        <w:t>图 1  Radxa Cubie A5E 产品外观</w:t>
+      </w:r>
+    </w:p>
+    <w:p>
+      <w:pPr>
+        <w:jc w:val="center"/>
+      </w:pPr>
+      <w:r>
+        <w:drawing>
+          <wp:inline xmlns:a="http://schemas.openxmlformats.org/drawingml/2006/main" xmlns:pic="http://schemas.openxmlformats.org/drawingml/2006/picture">
+            <wp:extent cx="5303520" cy="2581046"/>
+            <wp:docPr id="1" name="Picture 1"/>
+            <wp:cNvGraphicFramePr>
+              <a:graphicFrameLocks noChangeAspect="1"/>
+            </wp:cNvGraphicFramePr>
+            <a:graphic>
+              <a:graphicData uri="http://schemas.openxmlformats.org/drawingml/2006/picture">
+                <pic:pic>
+                  <pic:nvPicPr>
+                    <pic:cNvPr id="0" name="radxa-cubie-a5e-view.png"/>
+                    <pic:cNvPicPr/>
+                  </pic:nvPicPr>
+                  <pic:blipFill>
+                    <a:blip r:embed="rId9"/>
+                    <a:stretch>
+                      <a:fillRect/>
+                    </a:stretch>
+                  </pic:blipFill>
+                  <pic:spPr>
+                    <a:xfrm>
+                      <a:off x="0" y="0"/>
+                      <a:ext cx="5303520" cy="2581046"/>
+                    </a:xfrm>
+                    <a:prstGeom prst="rect"/>
+                  </pic:spPr>
+                </pic:pic>
+              </a:graphicData>
+            </a:graphic>
+          </wp:inline>
+        </w:drawing>
+      </w:r>
+    </w:p>
+    <w:p>
+      <w:r>
+        <w:t>图 2  Radxa Cubie A5E 接口标注</w:t>
+      </w:r>
+    </w:p>
+    <w:p>
+      <w:pPr>
+        <w:jc w:val="center"/>
+      </w:pPr>
+      <w:r>
+        <w:drawing>
+          <wp:inline xmlns:a="http://schemas.openxmlformats.org/drawingml/2006/main" xmlns:pic="http://schemas.openxmlformats.org/drawingml/2006/picture">
+            <wp:extent cx="5303520" cy="2526047"/>
+            <wp:docPr id="2" name="Picture 2"/>
+            <wp:cNvGraphicFramePr>
+              <a:graphicFrameLocks noChangeAspect="1"/>
+            </wp:cNvGraphicFramePr>
+            <a:graphic>
+              <a:graphicData uri="http://schemas.openxmlformats.org/drawingml/2006/picture">
+                <pic:pic>
+                  <pic:nvPicPr>
+                    <pic:cNvPr id="0" name="radxa-cubie-a5e-interface.png"/>
+                    <pic:cNvPicPr/>
+                  </pic:nvPicPr>
+                  <pic:blipFill>
+                    <a:blip r:embed="rId10"/>
+                    <a:stretch>
+                      <a:fillRect/>
+                    </a:stretch>
+                  </pic:blipFill>
+                  <pic:spPr>
+                    <a:xfrm>
+                      <a:off x="0" y="0"/>
+                      <a:ext cx="5303520" cy="2526047"/>
+                    </a:xfrm>
+                    <a:prstGeom prst="rect"/>
+                  </pic:spPr>
+                </pic:pic>
+              </a:graphicData>
+            </a:graphic>
+          </wp:inline>
+        </w:drawing>
+      </w:r>
+    </w:p>
+    <w:p>
+      <w:pPr>
+        <w:pStyle w:val="Heading1"/>
+      </w:pPr>
+      <w:r>
+        <w:t>二、申报背景</w:t>
       </w:r>
     </w:p>
     <w:p>
@@ -160,7 +476,7 @@
     </w:p>
     <w:p>
       <w:r>
-        <w:t>为提高采集链路稳定性和可复用性，拟购置一块小型边缘主控板，承担设备接入、数据汇聚、时间戳记录、轻量预处理、边缘缓存与网络转发任务。</w:t>
+        <w:t>因此需要一块小型边缘主控板，承担设备接入、数据汇聚、时间戳记录、轻量预处理、边缘缓存与网络转发任务，使采集链路从“临时拼接”转向“可复用、可移动、可复现”的实验平台。</w:t>
       </w:r>
     </w:p>
     <w:p>
@@ -168,17 +484,17 @@
         <w:pStyle w:val="Heading1"/>
       </w:pPr>
       <w:r>
-        <w:t>二、拟购置内容</w:t>
+        <w:t>三、拟购置内容</w:t>
       </w:r>
     </w:p>
     <w:p>
       <w:r>
-        <w:t>拟采购 Radxa Cubie A5E 迷你主板 1 块，必要时配套采购电源、存储卡、线材或外壳等基础附件。商品来源为淘宝链接：https://e.tb.cn/h.RcBfbN5y7bpWvFl?tk=XErF5GXZpEW，商品名称为“瑞莎 Radxa Cubie A5E 迷你主板 全志 A527 8核CPU 双千兆网口”。</w:t>
+        <w:t>拟采购 Radxa Cubie A5E 迷你主板 1 块，必要时配套采购电源、存储卡、线材或外壳等基础附件。用户提供的淘宝商品名称为“瑞莎 Radxa Cubie A5E 迷你主板 全志 A527 8核CPU 双千兆网口”，短链解析得到商品 ID 871582539578。</w:t>
       </w:r>
     </w:p>
     <w:p>
       <w:r>
-        <w:t>价格以提交采购时淘宝页面实际价格、运费险及配套附件需求为准。当前申报台账中暂按“待确认”记录，待截图和订单信息补齐后更新。</w:t>
+        <w:t>由于淘宝详情页触发登录/风控，实时价格和规格选项需在提交采购前人工核对并补充截图。当前申报台账暂按待确认记录，避免使用不可靠价格。</w:t>
       </w:r>
     </w:p>
     <w:p>
@@ -186,27 +502,32 @@
         <w:pStyle w:val="Heading1"/>
       </w:pPr>
       <w:r>
-        <w:t>三、技术适配性说明</w:t>
+        <w:t>四、技术适配性论证</w:t>
       </w:r>
     </w:p>
     <w:p>
       <w:r>
-        <w:t>1. 计算能力：Cubie A5E 搭载 8 核 Arm Cortex-A55 处理器，可满足采集程序、轻量预处理、数据缓存和网络转发等边缘任务。</w:t>
+        <w:t>1. 计算能力：官方文档显示 Cubie A5E 可选全志 A527 或 T527 SoC，搭载 8 核 Arm Cortex-A55 CPU，适合运行采集守护进程、轻量滤波、质量检查、时间戳记录和数据转发服务。</w:t>
       </w:r>
     </w:p>
     <w:p>
       <w:r>
-        <w:t>2. 网络能力：双千兆网口适合将雷达设备网络与上位机/实验室局域网分离，降低联调时网络冲突和带宽争用风险。</w:t>
+        <w:t>2. 网络能力：设备提供 2 个千兆以太网口，适合将雷达设备网络与上位机/实验室局域网分离，降低网络冲突和带宽争用，提升联调稳定性。</w:t>
       </w:r>
     </w:p>
     <w:p>
       <w:r>
-        <w:t>3. 扩展能力：USB 3.0、GPIO、M.2 2230 等接口便于连接声卡、ADC、心电采集模块、同步触发模块和本地存储设备。</w:t>
+        <w:t>3. 外设接入：USB 3.0 Type-A、USB Type-C OTG、40 Pin GPIO、UART/SPI/I2C 等接口可覆盖声卡、串口转换器、心电采集模块、同步触发模块等外设接入需求。</w:t>
       </w:r>
     </w:p>
     <w:p>
       <w:r>
-        <w:t>4. 系统形态：小体积、低功耗、可嵌入采集箱，适合桌面实验和移动采集场景。</w:t>
+        <w:t>4. 边缘缓存：microSD、eMMC 以及 M.2 M Key 2230 NVMe 支持可用于采集过程中的本地缓存、临时备份和离线数据转移。</w:t>
+      </w:r>
+    </w:p>
+    <w:p>
+      <w:r>
+        <w:t>5. 系统形态：主板尺寸紧凑，适合桌面实验和移动采集箱集成，有利于后续形成可重复部署的采集原型。</w:t>
       </w:r>
     </w:p>
     <w:p>
@@ -214,27 +535,17 @@
         <w:pStyle w:val="Heading1"/>
       </w:pPr>
       <w:r>
-        <w:t>四、预期用途</w:t>
+        <w:t>五、与雷达/心音/心电采集任务的对应关系</w:t>
       </w:r>
     </w:p>
     <w:p>
       <w:r>
-        <w:t>1. 构建雷达、心音、心电多模态同步采集原型链路。</w:t>
+        <w:t>雷达侧通常需要稳定的网络链路接收连续数据流；心音和心电侧需要 USB、串口、声卡或 ADC 类接口采集同步信号；多模态实验还需要统一时间戳、实验编号、受试者编号和数据归档规则。Cubie A5E 的双网口、USB、GPIO 和本地存储扩展正好覆盖上述关键需求。</w:t>
       </w:r>
     </w:p>
     <w:p>
       <w:r>
-        <w:t>2. 统一采集脚本和数据命名规则，形成实验编号、受试者编号、模态、时间戳对应的数据归档方式。</w:t>
-      </w:r>
-    </w:p>
-    <w:p>
-      <w:r>
-        <w:t>3. 在边缘端完成数据临时缓存、基本质量检查和局域网传输。</w:t>
-      </w:r>
-    </w:p>
-    <w:p>
-      <w:r>
-        <w:t>4. 支撑后续生命体征识别、心肺耦合分析、非接触式生理监测等算法研究。</w:t>
+        <w:t>使用该主板作为边缘节点后，可将雷达网络接入、心音/心电设备接入、触发同步、缓存归档和上位机转发集中到一个可配置节点上，减少实验人员每次搭建环境的重复工作。</w:t>
       </w:r>
     </w:p>
     <w:p>
@@ -242,27 +553,32 @@
         <w:pStyle w:val="Heading1"/>
       </w:pPr>
       <w:r>
-        <w:t>五、实施计划</w:t>
+        <w:t>六、实施计划</w:t>
       </w:r>
     </w:p>
     <w:p>
       <w:r>
-        <w:t>第一阶段：完成主板到货验收、系统烧录、远程登录、网络配置和基础稳定性测试。</w:t>
+        <w:t>第一阶段：补充淘宝商品主图、价格截图、规格选项截图，确认最终采购金额。</w:t>
       </w:r>
     </w:p>
     <w:p>
       <w:r>
-        <w:t>第二阶段：接入雷达设备网络，验证数据流接收、缓存和转发。</w:t>
+        <w:t>第二阶段：完成主板到货验收、系统烧录、远程登录、网络配置和基础稳定性测试。</w:t>
       </w:r>
     </w:p>
     <w:p>
       <w:r>
-        <w:t>第三阶段：接入心音/心电采集链路，验证采样时间戳记录、文件归档和多模态同步流程。</w:t>
+        <w:t>第三阶段：接入雷达设备网络，验证数据流接收、缓存和转发。</w:t>
       </w:r>
     </w:p>
     <w:p>
       <w:r>
-        <w:t>第四阶段：形成一次完整采集实验记录，补充商品截图、价格截图、到货照片和联调复盘。</w:t>
+        <w:t>第四阶段：接入心音/心电采集链路，验证采样时间戳记录、文件归档和多模态同步流程。</w:t>
+      </w:r>
+    </w:p>
+    <w:p>
+      <w:r>
+        <w:t>第五阶段：形成一次完整采集实验记录，补充到项目 README 的复盘记录中。</w:t>
       </w:r>
     </w:p>
     <w:p>
@@ -270,7 +586,7 @@
         <w:pStyle w:val="Heading1"/>
       </w:pPr>
       <w:r>
-        <w:t>六、预算说明</w:t>
+        <w:t>七、预算说明</w:t>
       </w:r>
     </w:p>
     <w:p>
@@ -283,7 +599,7 @@
         <w:pStyle w:val="Heading1"/>
       </w:pPr>
       <w:r>
-        <w:t>七、验收标准</w:t>
+        <w:t>八、验收标准</w:t>
       </w:r>
     </w:p>
     <w:p>
@@ -318,16 +634,16 @@
         <w:tblLook w:firstColumn="1" w:firstRow="1" w:lastColumn="0" w:lastRow="0" w:noHBand="0" w:noVBand="1" w:val="04A0"/>
       </w:tblPr>
       <w:tblGrid>
-        <w:gridCol w:w="1930"/>
-        <w:gridCol w:w="1930"/>
-        <w:gridCol w:w="1930"/>
-        <w:gridCol w:w="1930"/>
-        <w:gridCol w:w="1930"/>
+        <w:gridCol w:w="1958"/>
+        <w:gridCol w:w="1958"/>
+        <w:gridCol w:w="1958"/>
+        <w:gridCol w:w="1958"/>
+        <w:gridCol w:w="1958"/>
       </w:tblGrid>
       <w:tr>
         <w:tc>
           <w:tcPr>
-            <w:tcW w:type="dxa" w:w="1930"/>
+            <w:tcW w:type="dxa" w:w="1958"/>
           </w:tcPr>
           <w:p>
             <w:r>
@@ -337,7 +653,7 @@
         </w:tc>
         <w:tc>
           <w:tcPr>
-            <w:tcW w:type="dxa" w:w="1930"/>
+            <w:tcW w:type="dxa" w:w="1958"/>
           </w:tcPr>
           <w:p>
             <w:r>
@@ -347,7 +663,7 @@
         </w:tc>
         <w:tc>
           <w:tcPr>
-            <w:tcW w:type="dxa" w:w="1930"/>
+            <w:tcW w:type="dxa" w:w="1958"/>
           </w:tcPr>
           <w:p>
             <w:r>
@@ -357,7 +673,7 @@
         </w:tc>
         <w:tc>
           <w:tcPr>
-            <w:tcW w:type="dxa" w:w="1930"/>
+            <w:tcW w:type="dxa" w:w="1958"/>
           </w:tcPr>
           <w:p>
             <w:r>
@@ -367,7 +683,7 @@
         </w:tc>
         <w:tc>
           <w:tcPr>
-            <w:tcW w:type="dxa" w:w="1930"/>
+            <w:tcW w:type="dxa" w:w="1958"/>
           </w:tcPr>
           <w:p>
             <w:r>
@@ -379,7 +695,7 @@
       <w:tr>
         <w:tc>
           <w:tcPr>
-            <w:tcW w:type="dxa" w:w="1930"/>
+            <w:tcW w:type="dxa" w:w="1958"/>
           </w:tcPr>
           <w:p>
             <w:r>
@@ -389,7 +705,7 @@
         </w:tc>
         <w:tc>
           <w:tcPr>
-            <w:tcW w:type="dxa" w:w="1930"/>
+            <w:tcW w:type="dxa" w:w="1958"/>
           </w:tcPr>
           <w:p>
             <w:r>
@@ -399,7 +715,7 @@
         </w:tc>
         <w:tc>
           <w:tcPr>
-            <w:tcW w:type="dxa" w:w="1930"/>
+            <w:tcW w:type="dxa" w:w="1958"/>
           </w:tcPr>
           <w:p>
             <w:r>
@@ -409,7 +725,7 @@
         </w:tc>
         <w:tc>
           <w:tcPr>
-            <w:tcW w:type="dxa" w:w="1930"/>
+            <w:tcW w:type="dxa" w:w="1958"/>
           </w:tcPr>
           <w:p>
             <w:r>
@@ -419,11 +735,11 @@
         </w:tc>
         <w:tc>
           <w:tcPr>
-            <w:tcW w:type="dxa" w:w="1930"/>
+            <w:tcW w:type="dxa" w:w="1958"/>
           </w:tcPr>
           <w:p>
             <w:r>
-              <w:t>淘宝实时价格，含升级版运费险</w:t>
+              <w:t>淘宝商品 ID 871582539578，含升级版运费险</w:t>
             </w:r>
           </w:p>
         </w:tc>
@@ -431,7 +747,7 @@
       <w:tr>
         <w:tc>
           <w:tcPr>
-            <w:tcW w:type="dxa" w:w="1930"/>
+            <w:tcW w:type="dxa" w:w="1958"/>
           </w:tcPr>
           <w:p>
             <w:r>
@@ -441,7 +757,7 @@
         </w:tc>
         <w:tc>
           <w:tcPr>
-            <w:tcW w:type="dxa" w:w="1930"/>
+            <w:tcW w:type="dxa" w:w="1958"/>
           </w:tcPr>
           <w:p>
             <w:r>
@@ -451,7 +767,7 @@
         </w:tc>
         <w:tc>
           <w:tcPr>
-            <w:tcW w:type="dxa" w:w="1930"/>
+            <w:tcW w:type="dxa" w:w="1958"/>
           </w:tcPr>
           <w:p>
             <w:r>
@@ -461,7 +777,7 @@
         </w:tc>
         <w:tc>
           <w:tcPr>
-            <w:tcW w:type="dxa" w:w="1930"/>
+            <w:tcW w:type="dxa" w:w="1958"/>
           </w:tcPr>
           <w:p>
             <w:r>
@@ -471,7 +787,7 @@
         </w:tc>
         <w:tc>
           <w:tcPr>
-            <w:tcW w:type="dxa" w:w="1930"/>
+            <w:tcW w:type="dxa" w:w="1958"/>
           </w:tcPr>
           <w:p>
             <w:r>
@@ -483,7 +799,7 @@
       <w:tr>
         <w:tc>
           <w:tcPr>
-            <w:tcW w:type="dxa" w:w="1930"/>
+            <w:tcW w:type="dxa" w:w="1958"/>
           </w:tcPr>
           <w:p>
             <w:r>
@@ -493,7 +809,7 @@
         </w:tc>
         <w:tc>
           <w:tcPr>
-            <w:tcW w:type="dxa" w:w="1930"/>
+            <w:tcW w:type="dxa" w:w="1958"/>
           </w:tcPr>
           <w:p>
             <w:r/>
@@ -501,7 +817,7 @@
         </w:tc>
         <w:tc>
           <w:tcPr>
-            <w:tcW w:type="dxa" w:w="1930"/>
+            <w:tcW w:type="dxa" w:w="1958"/>
           </w:tcPr>
           <w:p>
             <w:r/>
@@ -509,7 +825,7 @@
         </w:tc>
         <w:tc>
           <w:tcPr>
-            <w:tcW w:type="dxa" w:w="1930"/>
+            <w:tcW w:type="dxa" w:w="1958"/>
           </w:tcPr>
           <w:p>
             <w:r>
@@ -519,7 +835,7 @@
         </w:tc>
         <w:tc>
           <w:tcPr>
-            <w:tcW w:type="dxa" w:w="1930"/>
+            <w:tcW w:type="dxa" w:w="1958"/>
           </w:tcPr>
           <w:p>
             <w:r>
@@ -531,18 +847,12 @@
     </w:tbl>
     <w:p>
       <w:r>
-        <w:rPr>
-          <w:b/>
-        </w:rPr>
-        <w:t>备注：</w:t>
-      </w:r>
-      <w:r>
-        <w:t>本申报书与同目录 README.md 配套维护，README 用于保存图片文案资料、申报结果、价格情况和后续复盘。</w:t>
+        <w:t>备注：本申报书与同目录 README.md 配套维护，README 用于保存图片文案资料、申报结果、价格情况和后续复盘。</w:t>
       </w:r>
     </w:p>
     <w:sectPr>
       <w:pgSz w:w="12240" w:h="15840"/>
-      <w:pgMar w:top="1152" w:right="1296" w:bottom="1152" w:left="1296" w:header="720" w:footer="720" w:gutter="0"/>
+      <w:pgMar w:top="1080" w:right="1224" w:bottom="1080" w:left="1224" w:header="720" w:footer="720" w:gutter="0"/>
       <w:cols w:space="720"/>
       <w:docGrid w:linePitch="360"/>
     </w:sectPr>
@@ -915,7 +1225,7 @@
     <w:rsid w:val="00FC693F"/>
     <w:rPr>
       <w:rFonts w:ascii="宋体" w:hAnsi="宋体"/>
-      <w:sz w:val="22"/>
+      <w:sz w:val="21"/>
     </w:rPr>
   </w:style>
   <w:style w:type="paragraph" w:styleId="Header">
@@ -981,7 +1291,7 @@
       <w:b/>
       <w:bCs/>
       <w:color w:val="365F91" w:themeColor="accent1" w:themeShade="BF"/>
-      <w:sz w:val="32"/>
+      <w:sz w:val="30"/>
       <w:szCs w:val="28"/>
     </w:rPr>
   </w:style>
@@ -1005,7 +1315,7 @@
       <w:b/>
       <w:bCs/>
       <w:color w:val="4F81BD" w:themeColor="accent1"/>
-      <w:sz w:val="26"/>
+      <w:sz w:val="24"/>
       <w:szCs w:val="26"/>
     </w:rPr>
   </w:style>

</xml_diff>

<commit_message>
Specify 4GB commercial Cubie A5E variant
</commit_message>
<xml_diff>
--- a/applications/2026/Q2/radar-vitals/申报书.docx
+++ b/applications/2026/Q2/radar-vitals/申报书.docx
@@ -67,7 +67,31 @@
           </w:tcPr>
           <w:p>
             <w:r>
-              <w:t>瑞莎 Radxa Cubie A5E 迷你主板（全志 A527 8核CPU，双千兆网口）</w:t>
+              <w:t>瑞莎 Radxa Cubie A5E 4GB 商业级迷你主板</w:t>
+            </w:r>
+          </w:p>
+        </w:tc>
+      </w:tr>
+      <w:tr>
+        <w:tc>
+          <w:tcPr>
+            <w:tcW w:type="dxa" w:w="4896"/>
+            <w:vAlign w:val="center"/>
+          </w:tcPr>
+          <w:p>
+            <w:r>
+              <w:t>选定规格</w:t>
+            </w:r>
+          </w:p>
+        </w:tc>
+        <w:tc>
+          <w:tcPr>
+            <w:tcW w:type="dxa" w:w="4896"/>
+            <w:vAlign w:val="center"/>
+          </w:tcPr>
+          <w:p>
+            <w:r>
+              <w:t>商业级 / Allwinner A527 SoC / 4GB 内存 / 双千兆网口</w:t>
             </w:r>
           </w:p>
         </w:tc>
@@ -187,7 +211,7 @@
           </w:tcPr>
           <w:p>
             <w:r>
-              <w:t>待确认，以淘宝实时价格、运费险及配套附件需求为准</w:t>
+              <w:t>待确认，以淘宝 4GB 商业级规格实时价格、运费险及配套附件需求为准</w:t>
             </w:r>
           </w:p>
         </w:tc>
@@ -283,6 +307,38 @@
           </w:tcPr>
           <w:p>
             <w:r>
+              <w:t>选定规格</w:t>
+            </w:r>
+          </w:p>
+        </w:tc>
+        <w:tc>
+          <w:tcPr>
+            <w:tcW w:type="dxa" w:w="3264"/>
+          </w:tcPr>
+          <w:p>
+            <w:r>
+              <w:t>本次采购指定 4GB 商业级 A527 版本。</w:t>
+            </w:r>
+          </w:p>
+        </w:tc>
+        <w:tc>
+          <w:tcPr>
+            <w:tcW w:type="dxa" w:w="3264"/>
+          </w:tcPr>
+          <w:p>
+            <w:r>
+              <w:t>明确规格边界，避免误选工业级 T527 或低内存版本。</w:t>
+            </w:r>
+          </w:p>
+        </w:tc>
+      </w:tr>
+      <w:tr>
+        <w:tc>
+          <w:tcPr>
+            <w:tcW w:type="dxa" w:w="3264"/>
+          </w:tcPr>
+          <w:p>
+            <w:r>
               <w:t>淘宝详情页</w:t>
             </w:r>
           </w:p>
@@ -303,7 +359,7 @@
           </w:tcPr>
           <w:p>
             <w:r>
-              <w:t>需采购前人工补充价格截图、规格截图和订单截图。</w:t>
+              <w:t>需采购前人工补充 4GB 商业级规格价格截图、规格截图和订单截图。</w:t>
             </w:r>
           </w:p>
         </w:tc>
@@ -489,12 +545,17 @@
     </w:p>
     <w:p>
       <w:r>
-        <w:t>拟采购 Radxa Cubie A5E 迷你主板 1 块，必要时配套采购电源、存储卡、线材或外壳等基础附件。用户提供的淘宝商品名称为“瑞莎 Radxa Cubie A5E 迷你主板 全志 A527 8核CPU 双千兆网口”，短链解析得到商品 ID 871582539578。</w:t>
+        <w:t>拟采购 Radxa Cubie A5E 4GB 商业级迷你主板 1 块，核心规格为 Allwinner A527 SoC、4GB 内存、双千兆网口。必要时配套采购电源、存储卡、线材或外壳等基础附件。用户提供的淘宝商品名称为“瑞莎 Radxa Cubie A5E 迷你主板 全志 A527 8核CPU 双千兆网口”，短链解析得到商品 ID 871582539578。</w:t>
       </w:r>
     </w:p>
     <w:p>
       <w:r>
-        <w:t>由于淘宝详情页触发登录/风控，实时价格和规格选项需在提交采购前人工核对并补充截图。当前申报台账暂按待确认记录，避免使用不可靠价格。</w:t>
+        <w:t>本次明确选择商业级 A527 / 4GB 版本，不选择工业级 T527 版本。该规格能够满足雷达、心音、心电同步采集场景中的网络转发、外设接入、时间戳记录和本地缓存需求，同时有利于控制预算。</w:t>
+      </w:r>
+    </w:p>
+    <w:p>
+      <w:r>
+        <w:t>由于淘宝详情页触发登录/风控，4GB 商业级规格的实时价格和规格选项需在提交采购前人工核对并补充截图。当前申报台账暂按待确认记录，避免使用不可靠价格。</w:t>
       </w:r>
     </w:p>
     <w:p>
@@ -507,7 +568,7 @@
     </w:p>
     <w:p>
       <w:r>
-        <w:t>1. 计算能力：官方文档显示 Cubie A5E 可选全志 A527 或 T527 SoC，搭载 8 核 Arm Cortex-A55 CPU，适合运行采集守护进程、轻量滤波、质量检查、时间戳记录和数据转发服务。</w:t>
+        <w:t>1. 计算能力：A527 版本搭载 8 核 Arm Cortex-A55 CPU，4GB 内存可满足采集守护进程、轻量滤波、质量检查、时间戳记录和数据转发服务运行需求。</w:t>
       </w:r>
     </w:p>
     <w:p>
@@ -527,7 +588,7 @@
     </w:p>
     <w:p>
       <w:r>
-        <w:t>5. 系统形态：主板尺寸紧凑，适合桌面实验和移动采集箱集成，有利于后续形成可重复部署的采集原型。</w:t>
+        <w:t>5. 成本合理性：商业级 A527 / 4GB 版本相比工业级 T527 更贴近当前实验室采集节点需求，避免为工业温区、NPU 等非必要特性承担额外预算。</w:t>
       </w:r>
     </w:p>
     <w:p>
@@ -540,7 +601,7 @@
     </w:p>
     <w:p>
       <w:r>
-        <w:t>雷达侧通常需要稳定的网络链路接收连续数据流；心音和心电侧需要 USB、串口、声卡或 ADC 类接口采集同步信号；多模态实验还需要统一时间戳、实验编号、受试者编号和数据归档规则。Cubie A5E 的双网口、USB、GPIO 和本地存储扩展正好覆盖上述关键需求。</w:t>
+        <w:t>雷达侧通常需要稳定的网络链路接收连续数据流；心音和心电侧需要 USB、串口、声卡或 ADC 类接口采集同步信号；多模态实验还需要统一时间戳、实验编号、受试者编号和数据归档规则。Cubie A5E 4GB 商业级版本的双网口、USB、GPIO 和本地存储扩展覆盖上述关键需求。</w:t>
       </w:r>
     </w:p>
     <w:p>
@@ -558,7 +619,7 @@
     </w:p>
     <w:p>
       <w:r>
-        <w:t>第一阶段：补充淘宝商品主图、价格截图、规格选项截图，确认最终采购金额。</w:t>
+        <w:t>第一阶段：通过淘宝 App 补充 4GB 商业级规格商品主图、价格截图、规格选项截图，确认最终采购金额。</w:t>
       </w:r>
     </w:p>
     <w:p>
@@ -591,7 +652,7 @@
     </w:p>
     <w:p>
       <w:r>
-        <w:t>预算由主板价格及必要配件构成。当前商品价格需以淘宝页面实时价格为准，申报台账中设置价格表，待采购前补充主板单价、配件单价、小计和订单截图。</w:t>
+        <w:t>预算由 4GB 商业级主板价格及必要配件构成。当前商品价格需以淘宝页面 4GB 商业级规格实时价格为准，申报台账中设置价格表，待采购前补充主板单价、配件单价、小计和订单截图。</w:t>
       </w:r>
     </w:p>
     <w:p>
@@ -604,27 +665,32 @@
     </w:p>
     <w:p>
       <w:r>
-        <w:t>1. 主板能够稳定启动，完成有线网络连接和远程管理。</w:t>
+        <w:t>1. 到货型号与申报规格一致，即 Radxa Cubie A5E 4GB 商业级 A527 版本。</w:t>
       </w:r>
     </w:p>
     <w:p>
       <w:r>
-        <w:t>2. 能够接入雷达设备网络并完成数据接收或转发验证。</w:t>
+        <w:t>2. 主板能够稳定启动，完成有线网络连接和远程管理。</w:t>
       </w:r>
     </w:p>
     <w:p>
       <w:r>
-        <w:t>3. 能够接入心音/心电采集链路，至少完成一次同步采集流程验证。</w:t>
+        <w:t>3. 能够接入雷达设备网络并完成数据接收或转发验证。</w:t>
       </w:r>
     </w:p>
     <w:p>
       <w:r>
-        <w:t>4. 采集数据能够按实验编号自动归档，并保留联调记录。</w:t>
+        <w:t>4. 能够接入心音/心电采集链路，至少完成一次同步采集流程验证。</w:t>
       </w:r>
     </w:p>
     <w:p>
       <w:r>
-        <w:t>5. 申报文件夹内补齐商品截图、价格截图、订单截图或到货照片。</w:t>
+        <w:t>5. 采集数据能够按实验编号自动归档，并保留联调记录。</w:t>
+      </w:r>
+    </w:p>
+    <w:p>
+      <w:r>
+        <w:t>6. 申报文件夹内补齐商品截图、价格截图、订单截图或到货照片。</w:t>
       </w:r>
     </w:p>
     <w:tbl>
@@ -699,7 +765,7 @@
           </w:tcPr>
           <w:p>
             <w:r>
-              <w:t>Radxa Cubie A5E 迷你主板</w:t>
+              <w:t>Radxa Cubie A5E 4GB 商业级迷你主板</w:t>
             </w:r>
           </w:p>
         </w:tc>
@@ -739,7 +805,7 @@
           </w:tcPr>
           <w:p>
             <w:r>
-              <w:t>淘宝商品 ID 871582539578，含升级版运费险</w:t>
+              <w:t>A527 SoC，淘宝商品 ID 871582539578，含升级版运费险</w:t>
             </w:r>
           </w:p>
         </w:tc>

</xml_diff>